<commit_message>
Regenerate the cache documentation DOCX and PDF
Render version 1.1 with its diagrams.
</commit_message>
<xml_diff>
--- a/docs/SmartPot_Cache_Documentation.docx
+++ b/docs/SmartPot_Cache_Documentation.docx
@@ -359,7 +359,7 @@
                 <w:sz w:val="19"/>
                 <w:szCs w:val="19"/>
               </w:rPr>
-              <w:t xml:space="preserve">1.0 · septiembre 2026</w:t>
+              <w:t xml:space="preserve">1.1 · octubre 2026</w:t>
             </w:r>
             <w:r>
               <w:rPr>
@@ -729,7 +729,7 @@
                 <w:sz w:val="17"/>
                 <w:szCs w:val="17"/>
               </w:rPr>
-              <w:t xml:space="preserve">1.0 · septiembre 2026</w:t>
+              <w:t xml:space="preserve">1.1 · octubre 2026</w:t>
             </w:r>
           </w:p>
         </w:tc>
@@ -1183,6 +1183,484 @@
     </w:p>
     <w:p>
       <w:pPr>
+        <w:spacing w:before="80" w:after="0" w:line="240" w:lineRule="auto"/>
+        <w:rPr>
+          <w:sz w:val="8"/>
+        </w:rPr>
+      </w:pPr>
+    </w:p>
+    <w:tbl>
+      <w:tblPr>
+        <w:tblW w:w="9360" w:type="dxa"/>
+        <w:tblInd w:w="0" w:type="dxa"/>
+        <w:tblBorders>
+          <w:top w:val="nil"/>
+          <w:left w:val="nil"/>
+          <w:bottom w:val="nil"/>
+          <w:right w:val="nil"/>
+          <w:insideH w:val="nil"/>
+          <w:insideV w:val="nil"/>
+        </w:tblBorders>
+        <w:tblLayout w:type="fixed"/>
+        <w:tblCellMar>
+          <w:left w:w="0" w:type="dxa"/>
+          <w:right w:w="0" w:type="dxa"/>
+        </w:tblCellMar>
+        <w:tblLook w:val="0000" w:firstRow="0" w:lastRow="0" w:firstColumn="0" w:lastColumn="0" w:noHBand="1" w:noVBand="1"/>
+      </w:tblPr>
+      <w:tblGrid>
+        <w:gridCol w:w="9360"/>
+      </w:tblGrid>
+      <w:tr>
+        <w:trPr>
+          <w:cantSplit/>
+        </w:trPr>
+        <w:tc>
+          <w:tcPr>
+            <w:tcW w:w="9360" w:type="dxa"/>
+            <w:shd w:val="clear" w:color="auto" w:fill="0B3D2B"/>
+            <w:tcMar>
+              <w:top w:w="60" w:type="dxa"/>
+              <w:left w:w="200" w:type="dxa"/>
+              <w:bottom w:w="60" w:type="dxa"/>
+              <w:right w:w="200" w:type="dxa"/>
+            </w:tcMar>
+            <w:vAlign w:val="top"/>
+          </w:tcPr>
+          <w:p>
+            <w:pPr>
+              <w:spacing w:before="0" w:after="0" w:line="240" w:lineRule="auto"/>
+            </w:pPr>
+            <w:r>
+              <w:rPr>
+                <w:b/>
+                <w:bCs/>
+                <w:color w:val="7FDBB0"/>
+                <w:spacing w:val="40"/>
+                <w:sz w:val="14"/>
+                <w:szCs w:val="14"/>
+              </w:rPr>
+              <w:t xml:space="preserve">MERMAID</w:t>
+            </w:r>
+          </w:p>
+        </w:tc>
+      </w:tr>
+    </w:tbl>
+    <w:tbl>
+      <w:tblPr>
+        <w:tblW w:w="9360" w:type="dxa"/>
+        <w:tblInd w:w="0" w:type="dxa"/>
+        <w:tblBorders>
+          <w:top w:val="nil"/>
+          <w:left w:val="nil"/>
+          <w:bottom w:val="nil"/>
+          <w:right w:val="nil"/>
+          <w:insideH w:val="nil"/>
+          <w:insideV w:val="nil"/>
+        </w:tblBorders>
+        <w:tblLayout w:type="fixed"/>
+        <w:tblCellMar>
+          <w:left w:w="0" w:type="dxa"/>
+          <w:right w:w="0" w:type="dxa"/>
+        </w:tblCellMar>
+        <w:tblLook w:val="0000" w:firstRow="0" w:lastRow="0" w:firstColumn="0" w:lastColumn="0" w:noHBand="1" w:noVBand="1"/>
+      </w:tblPr>
+      <w:tblGrid>
+        <w:gridCol w:w="9360"/>
+      </w:tblGrid>
+      <w:tr>
+        <w:trPr>
+          <w:cantSplit/>
+        </w:trPr>
+        <w:tc>
+          <w:tcPr>
+            <w:tcW w:w="9360" w:type="dxa"/>
+            <w:shd w:val="clear" w:color="auto" w:fill="F7FAF8"/>
+            <w:tcMar>
+              <w:top w:w="120" w:type="dxa"/>
+              <w:left w:w="200" w:type="dxa"/>
+              <w:bottom w:w="120" w:type="dxa"/>
+              <w:right w:w="200" w:type="dxa"/>
+            </w:tcMar>
+            <w:vAlign w:val="top"/>
+          </w:tcPr>
+          <w:p>
+            <w:pPr>
+              <w:spacing w:before="0" w:after="0" w:line="252" w:lineRule="auto"/>
+            </w:pPr>
+            <w:r>
+              <w:rPr>
+                <w:rFonts w:ascii="JetBrains Mono" w:hAnsi="JetBrains Mono" w:eastAsia="JetBrains Mono" w:cs="JetBrains Mono"/>
+                <w:color w:val="17261F"/>
+                <w:sz w:val="16"/>
+                <w:szCs w:val="16"/>
+              </w:rPr>
+              <w:t xml:space="preserve">%%{init: {"theme": "base", "fontFamily": "Segoe UI, Arial, sans-serif", "themeVariables": {"fontFamily": "Segoe UI, Arial, sans-serif", "fontSize": "15px", "primaryColor": "#DDF5EA", "primaryTextColor": "#17261F", "primaryBorderColor": "#067A52", "secondaryColor": "#E3F2FB", "secondaryTextColor": "#17261F", "secondaryBorderColor": "#1F6FA0", "tertiaryColor": "#F2F7F4", "tertiaryTextColor": "#17261F", "tertiaryBorderColor": "#D5E3DC", "lineColor": "#5B6B63", "textColor": "#17261F", "mainBkg": "#DDF5EA", "nodeBorder": "#067A52", "clusterBkg": "#F7FAF8", "clusterBorder": "#D5E3DC", "edgeLabelBackground": "#FFFFFF", "actorBkg": "#067A52", "actorBorder": "#0B3D2B", "actorTextColor": "#FFFFFF", "actorLineColor": "#5B6B63", "signalColor": "#17261F", "signalTextColor": "#17261F", "labelBoxBkgColor": "#0B3D2B", "labelBoxBorderColor": "#0B3D2B", "labelTextColor": "#FFFFFF", "loopTextColor": "#0B3D2B", "noteBkgColor": "#FDF4DD", "noteBorderColor": "#C98D12", "noteTextColor": "#17261F", "activationBkgColor": "#DDF5EA", "activationBorderColor": "#067A52", "attributeBackgroundColorOdd": "#FFFFFF", "attributeBackgroundColorEven": "#F2F7F4"}, "layout": "elk", "elk": {"nodePlacementStrategy": "BRANDES_KOEPF", "mergeEdges": false, "cycleBreakingStrategy": "GREEDY"}}}%%</w:t>
+            </w:r>
+          </w:p>
+          <w:p>
+            <w:pPr>
+              <w:spacing w:before="0" w:after="0" w:line="252" w:lineRule="auto"/>
+            </w:pPr>
+            <w:r>
+              <w:rPr>
+                <w:rFonts w:ascii="JetBrains Mono" w:hAnsi="JetBrains Mono" w:eastAsia="JetBrains Mono" w:cs="JetBrains Mono"/>
+                <w:color w:val="17261F"/>
+                <w:sz w:val="16"/>
+                <w:szCs w:val="16"/>
+              </w:rPr>
+              <w:t xml:space="preserve">flowchart LR</w:t>
+            </w:r>
+          </w:p>
+          <w:p>
+            <w:pPr>
+              <w:spacing w:before="0" w:after="0" w:line="252" w:lineRule="auto"/>
+            </w:pPr>
+            <w:r>
+              <w:rPr>
+                <w:rFonts w:ascii="JetBrains Mono" w:hAnsi="JetBrains Mono" w:eastAsia="JetBrains Mono" w:cs="JetBrains Mono"/>
+                <w:color w:val="17261F"/>
+                <w:sz w:val="16"/>
+                <w:szCs w:val="16"/>
+              </w:rPr>
+              <w:t xml:space="preserve">  api["SmartPot-API&lt;br/&gt;CacheStore"]</w:t>
+            </w:r>
+          </w:p>
+          <w:p>
+            <w:pPr>
+              <w:spacing w:before="0" w:after="0" w:line="252" w:lineRule="auto"/>
+            </w:pPr>
+            <w:r>
+              <w:rPr>
+                <w:rFonts w:ascii="JetBrains Mono" w:hAnsi="JetBrains Mono" w:eastAsia="JetBrains Mono" w:cs="JetBrains Mono"/>
+                <w:color w:val="17261F"/>
+                <w:sz w:val="16"/>
+                <w:szCs w:val="16"/>
+              </w:rPr>
+              <w:t xml:space="preserve">  subgraph imagen["Imagen smartpot-cache · redis:8.8-alpine · usuario 999"]</w:t>
+            </w:r>
+          </w:p>
+          <w:p>
+            <w:pPr>
+              <w:spacing w:before="0" w:after="0" w:line="252" w:lineRule="auto"/>
+            </w:pPr>
+            <w:r>
+              <w:rPr>
+                <w:rFonts w:ascii="JetBrains Mono" w:hAnsi="JetBrains Mono" w:eastAsia="JetBrains Mono" w:cs="JetBrains Mono"/>
+                <w:color w:val="17261F"/>
+                <w:sz w:val="16"/>
+                <w:szCs w:val="16"/>
+              </w:rPr>
+              <w:t xml:space="preserve">    direction TB</w:t>
+            </w:r>
+          </w:p>
+          <w:p>
+            <w:pPr>
+              <w:spacing w:before="0" w:after="0" w:line="252" w:lineRule="auto"/>
+            </w:pPr>
+            <w:r>
+              <w:rPr>
+                <w:rFonts w:ascii="JetBrains Mono" w:hAnsi="JetBrains Mono" w:eastAsia="JetBrains Mono" w:cs="JetBrains Mono"/>
+                <w:color w:val="17261F"/>
+                <w:sz w:val="16"/>
+                <w:szCs w:val="16"/>
+              </w:rPr>
+              <w:t xml:space="preserve">    entry["entrypoint.sh&lt;br/&gt;genera la configuración en /tmp&lt;br/&gt;con REDIS_PASSWORD · no la imprime"]</w:t>
+            </w:r>
+          </w:p>
+          <w:p>
+            <w:pPr>
+              <w:spacing w:before="0" w:after="0" w:line="252" w:lineRule="auto"/>
+            </w:pPr>
+            <w:r>
+              <w:rPr>
+                <w:rFonts w:ascii="JetBrains Mono" w:hAnsi="JetBrains Mono" w:eastAsia="JetBrains Mono" w:cs="JetBrains Mono"/>
+                <w:color w:val="17261F"/>
+                <w:sz w:val="16"/>
+                <w:szCs w:val="16"/>
+              </w:rPr>
+              <w:t xml:space="preserve">    redis["Redis&lt;br/&gt;requirepass · sin persistencia&lt;br/&gt;LRU con REDIS_MAXMEMORY"]</w:t>
+            </w:r>
+          </w:p>
+          <w:p>
+            <w:pPr>
+              <w:spacing w:before="0" w:after="0" w:line="252" w:lineRule="auto"/>
+            </w:pPr>
+            <w:r>
+              <w:rPr>
+                <w:rFonts w:ascii="JetBrains Mono" w:hAnsi="JetBrains Mono" w:eastAsia="JetBrains Mono" w:cs="JetBrains Mono"/>
+                <w:color w:val="17261F"/>
+                <w:sz w:val="16"/>
+                <w:szCs w:val="16"/>
+              </w:rPr>
+              <w:t xml:space="preserve">    blocked["Deshabilitados&lt;br/&gt;FLUSHALL · FLUSHDB · CONFIG&lt;br/&gt;DEBUG · SHUTDOWN"]</w:t>
+            </w:r>
+          </w:p>
+          <w:p>
+            <w:pPr>
+              <w:spacing w:before="0" w:after="0" w:line="252" w:lineRule="auto"/>
+            </w:pPr>
+            <w:r>
+              <w:rPr>
+                <w:rFonts w:ascii="JetBrains Mono" w:hAnsi="JetBrains Mono" w:eastAsia="JetBrains Mono" w:cs="JetBrains Mono"/>
+                <w:color w:val="17261F"/>
+                <w:sz w:val="16"/>
+                <w:szCs w:val="16"/>
+              </w:rPr>
+              <w:t xml:space="preserve">  end</w:t>
+            </w:r>
+          </w:p>
+          <w:p>
+            <w:pPr>
+              <w:spacing w:before="0" w:after="0" w:line="252" w:lineRule="auto"/>
+            </w:pPr>
+            <w:r>
+              <w:rPr>
+                <w:rFonts w:ascii="JetBrains Mono" w:hAnsi="JetBrains Mono" w:eastAsia="JetBrains Mono" w:cs="JetBrains Mono"/>
+                <w:color w:val="17261F"/>
+                <w:sz w:val="16"/>
+                <w:szCs w:val="16"/>
+              </w:rPr>
+              <w:t xml:space="preserve">  local["Memoria local de la API&lt;br/&gt;30 s si Redis no responde"]</w:t>
+            </w:r>
+          </w:p>
+          <w:p>
+            <w:pPr>
+              <w:spacing w:before="0" w:after="0" w:line="252" w:lineRule="auto"/>
+            </w:pPr>
+            <w:r>
+              <w:rPr>
+                <w:rFonts w:ascii="JetBrains Mono" w:hAnsi="JetBrains Mono" w:eastAsia="JetBrains Mono" w:cs="JetBrains Mono"/>
+                <w:color w:val="17261F"/>
+                <w:sz w:val="16"/>
+                <w:szCs w:val="16"/>
+              </w:rPr>
+              <w:t xml:space="preserve">  api --&gt;|"red interna · contraseña"| redis</w:t>
+            </w:r>
+          </w:p>
+          <w:p>
+            <w:pPr>
+              <w:spacing w:before="0" w:after="0" w:line="252" w:lineRule="auto"/>
+            </w:pPr>
+            <w:r>
+              <w:rPr>
+                <w:rFonts w:ascii="JetBrains Mono" w:hAnsi="JetBrains Mono" w:eastAsia="JetBrains Mono" w:cs="JetBrains Mono"/>
+                <w:color w:val="17261F"/>
+                <w:sz w:val="16"/>
+                <w:szCs w:val="16"/>
+              </w:rPr>
+              <w:t xml:space="preserve">  entry --&gt; redis</w:t>
+            </w:r>
+          </w:p>
+          <w:p>
+            <w:pPr>
+              <w:spacing w:before="0" w:after="0" w:line="252" w:lineRule="auto"/>
+            </w:pPr>
+            <w:r>
+              <w:rPr>
+                <w:rFonts w:ascii="JetBrains Mono" w:hAnsi="JetBrains Mono" w:eastAsia="JetBrains Mono" w:cs="JetBrains Mono"/>
+                <w:color w:val="17261F"/>
+                <w:sz w:val="16"/>
+                <w:szCs w:val="16"/>
+              </w:rPr>
+              <w:t xml:space="preserve">  redis --- blocked</w:t>
+            </w:r>
+          </w:p>
+          <w:p>
+            <w:pPr>
+              <w:spacing w:before="0" w:after="0" w:line="252" w:lineRule="auto"/>
+            </w:pPr>
+            <w:r>
+              <w:rPr>
+                <w:rFonts w:ascii="JetBrains Mono" w:hAnsi="JetBrains Mono" w:eastAsia="JetBrains Mono" w:cs="JetBrains Mono"/>
+                <w:color w:val="17261F"/>
+                <w:sz w:val="16"/>
+                <w:szCs w:val="16"/>
+              </w:rPr>
+              <w:t xml:space="preserve">  api -.-&gt;|"respaldo"| local</w:t>
+            </w:r>
+          </w:p>
+          <w:p>
+            <w:pPr>
+              <w:spacing w:before="0" w:after="0" w:line="252" w:lineRule="auto"/>
+            </w:pPr>
+            <w:r>
+              <w:rPr>
+                <w:rFonts w:ascii="JetBrains Mono" w:hAnsi="JetBrains Mono" w:eastAsia="JetBrains Mono" w:cs="JetBrains Mono"/>
+                <w:color w:val="17261F"/>
+                <w:sz w:val="16"/>
+                <w:szCs w:val="16"/>
+              </w:rPr>
+              <w:t xml:space="preserve">  classDef leaf fill:#DDF5EA,stroke:#067A52,color:#17261F</w:t>
+            </w:r>
+          </w:p>
+          <w:p>
+            <w:pPr>
+              <w:spacing w:before="0" w:after="0" w:line="252" w:lineRule="auto"/>
+            </w:pPr>
+            <w:r>
+              <w:rPr>
+                <w:rFonts w:ascii="JetBrains Mono" w:hAnsi="JetBrains Mono" w:eastAsia="JetBrains Mono" w:cs="JetBrains Mono"/>
+                <w:color w:val="17261F"/>
+                <w:sz w:val="16"/>
+                <w:szCs w:val="16"/>
+              </w:rPr>
+              <w:t xml:space="preserve">  classDef water fill:#E3F2FB,stroke:#1F6FA0,color:#17261F</w:t>
+            </w:r>
+          </w:p>
+          <w:p>
+            <w:pPr>
+              <w:spacing w:before="0" w:after="0" w:line="252" w:lineRule="auto"/>
+            </w:pPr>
+            <w:r>
+              <w:rPr>
+                <w:rFonts w:ascii="JetBrains Mono" w:hAnsi="JetBrains Mono" w:eastAsia="JetBrains Mono" w:cs="JetBrains Mono"/>
+                <w:color w:val="17261F"/>
+                <w:sz w:val="16"/>
+                <w:szCs w:val="16"/>
+              </w:rPr>
+              <w:t xml:space="preserve">  classDef sun fill:#FDF4DD,stroke:#C98D12,color:#17261F</w:t>
+            </w:r>
+          </w:p>
+          <w:p>
+            <w:pPr>
+              <w:spacing w:before="0" w:after="0" w:line="252" w:lineRule="auto"/>
+            </w:pPr>
+            <w:r>
+              <w:rPr>
+                <w:rFonts w:ascii="JetBrains Mono" w:hAnsi="JetBrains Mono" w:eastAsia="JetBrains Mono" w:cs="JetBrains Mono"/>
+                <w:color w:val="17261F"/>
+                <w:sz w:val="16"/>
+                <w:szCs w:val="16"/>
+              </w:rPr>
+              <w:t xml:space="preserve">  classDef clay fill:#FBE9E1,stroke:#B85A38,color:#17261F</w:t>
+            </w:r>
+          </w:p>
+          <w:p>
+            <w:pPr>
+              <w:spacing w:before="0" w:after="0" w:line="252" w:lineRule="auto"/>
+            </w:pPr>
+            <w:r>
+              <w:rPr>
+                <w:rFonts w:ascii="JetBrains Mono" w:hAnsi="JetBrains Mono" w:eastAsia="JetBrains Mono" w:cs="JetBrains Mono"/>
+                <w:color w:val="17261F"/>
+                <w:sz w:val="16"/>
+                <w:szCs w:val="16"/>
+              </w:rPr>
+              <w:t xml:space="preserve">  classDef core fill:#067A52,stroke:#0B3D2B,color:#FFFFFF</w:t>
+            </w:r>
+          </w:p>
+          <w:p>
+            <w:pPr>
+              <w:spacing w:before="0" w:after="0" w:line="252" w:lineRule="auto"/>
+            </w:pPr>
+            <w:r>
+              <w:rPr>
+                <w:rFonts w:ascii="JetBrains Mono" w:hAnsi="JetBrains Mono" w:eastAsia="JetBrains Mono" w:cs="JetBrains Mono"/>
+                <w:color w:val="17261F"/>
+                <w:sz w:val="16"/>
+                <w:szCs w:val="16"/>
+              </w:rPr>
+              <w:t xml:space="preserve">  classDef deep fill:#0B3D2B,stroke:#06281C,color:#FFFFFF</w:t>
+            </w:r>
+          </w:p>
+          <w:p>
+            <w:pPr>
+              <w:spacing w:before="0" w:after="0" w:line="252" w:lineRule="auto"/>
+            </w:pPr>
+            <w:r>
+              <w:rPr>
+                <w:rFonts w:ascii="JetBrains Mono" w:hAnsi="JetBrains Mono" w:eastAsia="JetBrains Mono" w:cs="JetBrains Mono"/>
+                <w:color w:val="17261F"/>
+                <w:sz w:val="16"/>
+                <w:szCs w:val="16"/>
+              </w:rPr>
+              <w:t xml:space="preserve">  classDef muted fill:#F2F7F4,stroke:#5B6B63,color:#17261F</w:t>
+            </w:r>
+          </w:p>
+          <w:p>
+            <w:pPr>
+              <w:spacing w:before="0" w:after="0" w:line="252" w:lineRule="auto"/>
+            </w:pPr>
+            <w:r>
+              <w:rPr>
+                <w:rFonts w:ascii="JetBrains Mono" w:hAnsi="JetBrains Mono" w:eastAsia="JetBrains Mono" w:cs="JetBrains Mono"/>
+                <w:color w:val="17261F"/>
+                <w:sz w:val="16"/>
+                <w:szCs w:val="16"/>
+              </w:rPr>
+              <w:t xml:space="preserve">  class api water</w:t>
+            </w:r>
+          </w:p>
+          <w:p>
+            <w:pPr>
+              <w:spacing w:before="0" w:after="0" w:line="252" w:lineRule="auto"/>
+            </w:pPr>
+            <w:r>
+              <w:rPr>
+                <w:rFonts w:ascii="JetBrains Mono" w:hAnsi="JetBrains Mono" w:eastAsia="JetBrains Mono" w:cs="JetBrains Mono"/>
+                <w:color w:val="17261F"/>
+                <w:sz w:val="16"/>
+                <w:szCs w:val="16"/>
+              </w:rPr>
+              <w:t xml:space="preserve">  class entry muted</w:t>
+            </w:r>
+          </w:p>
+          <w:p>
+            <w:pPr>
+              <w:spacing w:before="0" w:after="0" w:line="252" w:lineRule="auto"/>
+            </w:pPr>
+            <w:r>
+              <w:rPr>
+                <w:rFonts w:ascii="JetBrains Mono" w:hAnsi="JetBrains Mono" w:eastAsia="JetBrains Mono" w:cs="JetBrains Mono"/>
+                <w:color w:val="17261F"/>
+                <w:sz w:val="16"/>
+                <w:szCs w:val="16"/>
+              </w:rPr>
+              <w:t xml:space="preserve">  class redis core</w:t>
+            </w:r>
+          </w:p>
+          <w:p>
+            <w:pPr>
+              <w:spacing w:before="0" w:after="0" w:line="252" w:lineRule="auto"/>
+            </w:pPr>
+            <w:r>
+              <w:rPr>
+                <w:rFonts w:ascii="JetBrains Mono" w:hAnsi="JetBrains Mono" w:eastAsia="JetBrains Mono" w:cs="JetBrains Mono"/>
+                <w:color w:val="17261F"/>
+                <w:sz w:val="16"/>
+                <w:szCs w:val="16"/>
+              </w:rPr>
+              <w:t xml:space="preserve">  class blocked clay</w:t>
+            </w:r>
+          </w:p>
+          <w:p>
+            <w:pPr>
+              <w:spacing w:before="0" w:after="0" w:line="252" w:lineRule="auto"/>
+            </w:pPr>
+            <w:r>
+              <w:rPr>
+                <w:rFonts w:ascii="JetBrains Mono" w:hAnsi="JetBrains Mono" w:eastAsia="JetBrains Mono" w:cs="JetBrains Mono"/>
+                <w:color w:val="17261F"/>
+                <w:sz w:val="16"/>
+                <w:szCs w:val="16"/>
+              </w:rPr>
+              <w:t xml:space="preserve">  class local sun</w:t>
+            </w:r>
+          </w:p>
+        </w:tc>
+      </w:tr>
+    </w:tbl>
+    <w:p>
+      <w:pPr>
+        <w:spacing w:before="160" w:after="0" w:line="240" w:lineRule="auto"/>
+        <w:rPr>
+          <w:sz w:val="8"/>
+        </w:rPr>
+      </w:pPr>
+    </w:p>
+    <w:p>
+      <w:pPr>
         <w:keepNext/>
         <w:spacing w:before="360" w:after="40" w:line="288" w:lineRule="auto"/>
       </w:pPr>
@@ -1224,7 +1702,7 @@
       <w:r>
         <w:drawing>
           <wp:inline distT="0" distB="0" distL="0" distR="0">
-            <wp:extent cx="5943600" cy="1015553"/>
+            <wp:extent cx="5943600" cy="726833"/>
             <wp:docPr id="109" name="SmartPot_Cache_01_Keys"/>
             <wp:cNvGraphicFramePr>
               <a:graphicFrameLocks noChangeAspect="1"/>
@@ -1245,7 +1723,7 @@
                   <pic:spPr>
                     <a:xfrm>
                       <a:off x="0" y="0"/>
-                      <a:ext cx="5943600" cy="1015553"/>
+                      <a:ext cx="5943600" cy="726833"/>
                     </a:xfrm>
                     <a:prstGeom prst="rect">
                       <a:avLst/>
@@ -1283,6 +1761,554 @@
         </w:rPr>
         <w:t xml:space="preserve">  ·  Quién escribe cada llave y cuánto vive</w:t>
       </w:r>
+    </w:p>
+    <w:p>
+      <w:pPr>
+        <w:spacing w:before="80" w:after="0" w:line="240" w:lineRule="auto"/>
+        <w:rPr>
+          <w:sz w:val="8"/>
+        </w:rPr>
+      </w:pPr>
+    </w:p>
+    <w:tbl>
+      <w:tblPr>
+        <w:tblW w:w="9360" w:type="dxa"/>
+        <w:tblInd w:w="0" w:type="dxa"/>
+        <w:tblBorders>
+          <w:top w:val="nil"/>
+          <w:left w:val="nil"/>
+          <w:bottom w:val="nil"/>
+          <w:right w:val="nil"/>
+          <w:insideH w:val="nil"/>
+          <w:insideV w:val="nil"/>
+        </w:tblBorders>
+        <w:tblLayout w:type="fixed"/>
+        <w:tblCellMar>
+          <w:left w:w="0" w:type="dxa"/>
+          <w:right w:w="0" w:type="dxa"/>
+        </w:tblCellMar>
+        <w:tblLook w:val="0000" w:firstRow="0" w:lastRow="0" w:firstColumn="0" w:lastColumn="0" w:noHBand="1" w:noVBand="1"/>
+      </w:tblPr>
+      <w:tblGrid>
+        <w:gridCol w:w="9360"/>
+      </w:tblGrid>
+      <w:tr>
+        <w:trPr>
+          <w:cantSplit/>
+        </w:trPr>
+        <w:tc>
+          <w:tcPr>
+            <w:tcW w:w="9360" w:type="dxa"/>
+            <w:shd w:val="clear" w:color="auto" w:fill="0B3D2B"/>
+            <w:tcMar>
+              <w:top w:w="60" w:type="dxa"/>
+              <w:left w:w="200" w:type="dxa"/>
+              <w:bottom w:w="60" w:type="dxa"/>
+              <w:right w:w="200" w:type="dxa"/>
+            </w:tcMar>
+            <w:vAlign w:val="top"/>
+          </w:tcPr>
+          <w:p>
+            <w:pPr>
+              <w:spacing w:before="0" w:after="0" w:line="240" w:lineRule="auto"/>
+            </w:pPr>
+            <w:r>
+              <w:rPr>
+                <w:b/>
+                <w:bCs/>
+                <w:color w:val="7FDBB0"/>
+                <w:spacing w:val="40"/>
+                <w:sz w:val="14"/>
+                <w:szCs w:val="14"/>
+              </w:rPr>
+              <w:t xml:space="preserve">MERMAID</w:t>
+            </w:r>
+          </w:p>
+        </w:tc>
+      </w:tr>
+    </w:tbl>
+    <w:tbl>
+      <w:tblPr>
+        <w:tblW w:w="9360" w:type="dxa"/>
+        <w:tblInd w:w="0" w:type="dxa"/>
+        <w:tblBorders>
+          <w:top w:val="nil"/>
+          <w:left w:val="nil"/>
+          <w:bottom w:val="nil"/>
+          <w:right w:val="nil"/>
+          <w:insideH w:val="nil"/>
+          <w:insideV w:val="nil"/>
+        </w:tblBorders>
+        <w:tblLayout w:type="fixed"/>
+        <w:tblCellMar>
+          <w:left w:w="0" w:type="dxa"/>
+          <w:right w:w="0" w:type="dxa"/>
+        </w:tblCellMar>
+        <w:tblLook w:val="0000" w:firstRow="0" w:lastRow="0" w:firstColumn="0" w:lastColumn="0" w:noHBand="1" w:noVBand="1"/>
+      </w:tblPr>
+      <w:tblGrid>
+        <w:gridCol w:w="9360"/>
+      </w:tblGrid>
+      <w:tr>
+        <w:trPr>
+          <w:cantSplit/>
+        </w:trPr>
+        <w:tc>
+          <w:tcPr>
+            <w:tcW w:w="9360" w:type="dxa"/>
+            <w:shd w:val="clear" w:color="auto" w:fill="F7FAF8"/>
+            <w:tcMar>
+              <w:top w:w="120" w:type="dxa"/>
+              <w:left w:w="200" w:type="dxa"/>
+              <w:bottom w:w="120" w:type="dxa"/>
+              <w:right w:w="200" w:type="dxa"/>
+            </w:tcMar>
+            <w:vAlign w:val="top"/>
+          </w:tcPr>
+          <w:p>
+            <w:pPr>
+              <w:spacing w:before="0" w:after="0" w:line="252" w:lineRule="auto"/>
+            </w:pPr>
+            <w:r>
+              <w:rPr>
+                <w:rFonts w:ascii="JetBrains Mono" w:hAnsi="JetBrains Mono" w:eastAsia="JetBrains Mono" w:cs="JetBrains Mono"/>
+                <w:color w:val="17261F"/>
+                <w:sz w:val="16"/>
+                <w:szCs w:val="16"/>
+              </w:rPr>
+              <w:t xml:space="preserve">%%{init: {"theme": "base", "fontFamily": "Segoe UI, Arial, sans-serif", "themeVariables": {"fontFamily": "Segoe UI, Arial, sans-serif", "fontSize": "15px", "primaryColor": "#DDF5EA", "primaryTextColor": "#17261F", "primaryBorderColor": "#067A52", "secondaryColor": "#E3F2FB", "secondaryTextColor": "#17261F", "secondaryBorderColor": "#1F6FA0", "tertiaryColor": "#F2F7F4", "tertiaryTextColor": "#17261F", "tertiaryBorderColor": "#D5E3DC", "lineColor": "#5B6B63", "textColor": "#17261F", "mainBkg": "#DDF5EA", "nodeBorder": "#067A52", "clusterBkg": "#F7FAF8", "clusterBorder": "#D5E3DC", "edgeLabelBackground": "#FFFFFF", "actorBkg": "#067A52", "actorBorder": "#0B3D2B", "actorTextColor": "#FFFFFF", "actorLineColor": "#5B6B63", "signalColor": "#17261F", "signalTextColor": "#17261F", "labelBoxBkgColor": "#0B3D2B", "labelBoxBorderColor": "#0B3D2B", "labelTextColor": "#FFFFFF", "loopTextColor": "#0B3D2B", "noteBkgColor": "#FDF4DD", "noteBorderColor": "#C98D12", "noteTextColor": "#17261F", "activationBkgColor": "#DDF5EA", "activationBorderColor": "#067A52", "attributeBackgroundColorOdd": "#FFFFFF", "attributeBackgroundColorEven": "#F2F7F4"}}}%%</w:t>
+            </w:r>
+          </w:p>
+          <w:p>
+            <w:pPr>
+              <w:spacing w:before="0" w:after="0" w:line="252" w:lineRule="auto"/>
+            </w:pPr>
+            <w:r>
+              <w:rPr>
+                <w:rFonts w:ascii="JetBrains Mono" w:hAnsi="JetBrains Mono" w:eastAsia="JetBrains Mono" w:cs="JetBrains Mono"/>
+                <w:color w:val="17261F"/>
+                <w:sz w:val="16"/>
+                <w:szCs w:val="16"/>
+              </w:rPr>
+              <w:t xml:space="preserve">flowchart TB</w:t>
+            </w:r>
+          </w:p>
+          <w:p>
+            <w:pPr>
+              <w:spacing w:before="0" w:after="0" w:line="252" w:lineRule="auto"/>
+            </w:pPr>
+            <w:r>
+              <w:rPr>
+                <w:rFonts w:ascii="JetBrains Mono" w:hAnsi="JetBrains Mono" w:eastAsia="JetBrains Mono" w:cs="JetBrains Mono"/>
+                <w:color w:val="17261F"/>
+                <w:sz w:val="16"/>
+                <w:szCs w:val="16"/>
+              </w:rPr>
+              <w:t xml:space="preserve">  subgraph llaves["Llaves smartpot:*"]</w:t>
+            </w:r>
+          </w:p>
+          <w:p>
+            <w:pPr>
+              <w:spacing w:before="0" w:after="0" w:line="252" w:lineRule="auto"/>
+            </w:pPr>
+            <w:r>
+              <w:rPr>
+                <w:rFonts w:ascii="JetBrains Mono" w:hAnsi="JetBrains Mono" w:eastAsia="JetBrains Mono" w:cs="JetBrains Mono"/>
+                <w:color w:val="17261F"/>
+                <w:sz w:val="16"/>
+                <w:szCs w:val="16"/>
+              </w:rPr>
+              <w:t xml:space="preserve">    direction TB</w:t>
+            </w:r>
+          </w:p>
+          <w:p>
+            <w:pPr>
+              <w:spacing w:before="0" w:after="0" w:line="252" w:lineRule="auto"/>
+            </w:pPr>
+            <w:r>
+              <w:rPr>
+                <w:rFonts w:ascii="JetBrains Mono" w:hAnsi="JetBrains Mono" w:eastAsia="JetBrains Mono" w:cs="JetBrains Mono"/>
+                <w:color w:val="17261F"/>
+                <w:sz w:val="16"/>
+                <w:szCs w:val="16"/>
+              </w:rPr>
+              <w:t xml:space="preserve">    rate["rate:* · 1 minuto&lt;br/&gt;300 por IP · 10 en /auth"]</w:t>
+            </w:r>
+          </w:p>
+          <w:p>
+            <w:pPr>
+              <w:spacing w:before="0" w:after="0" w:line="252" w:lineRule="auto"/>
+            </w:pPr>
+            <w:r>
+              <w:rPr>
+                <w:rFonts w:ascii="JetBrains Mono" w:hAnsi="JetBrains Mono" w:eastAsia="JetBrains Mono" w:cs="JetBrains Mono"/>
+                <w:color w:val="17261F"/>
+                <w:sz w:val="16"/>
+                <w:szCs w:val="16"/>
+              </w:rPr>
+              <w:t xml:space="preserve">    reading["reading:cropId · 5 s&lt;br/&gt;una lectura por cultivo"]</w:t>
+            </w:r>
+          </w:p>
+          <w:p>
+            <w:pPr>
+              <w:spacing w:before="0" w:after="0" w:line="252" w:lineRule="auto"/>
+            </w:pPr>
+            <w:r>
+              <w:rPr>
+                <w:rFonts w:ascii="JetBrains Mono" w:hAnsi="JetBrains Mono" w:eastAsia="JetBrains Mono" w:cs="JetBrains Mono"/>
+                <w:color w:val="17261F"/>
+                <w:sz w:val="16"/>
+                <w:szCs w:val="16"/>
+              </w:rPr>
+              <w:t xml:space="preserve">    aieval["ai-eval:cropId · 30 s o 5 min&lt;br/&gt;frecuencia de evaluación"]</w:t>
+            </w:r>
+          </w:p>
+          <w:p>
+            <w:pPr>
+              <w:spacing w:before="0" w:after="0" w:line="252" w:lineRule="auto"/>
+            </w:pPr>
+            <w:r>
+              <w:rPr>
+                <w:rFonts w:ascii="JetBrains Mono" w:hAnsi="JetBrains Mono" w:eastAsia="JetBrains Mono" w:cs="JetBrains Mono"/>
+                <w:color w:val="17261F"/>
+                <w:sz w:val="16"/>
+                <w:szCs w:val="16"/>
+              </w:rPr>
+              <w:t xml:space="preserve">    agent["agent:cropId:actuador · 10 min&lt;br/&gt;enfriamiento del agente"]</w:t>
+            </w:r>
+          </w:p>
+          <w:p>
+            <w:pPr>
+              <w:spacing w:before="0" w:after="0" w:line="252" w:lineRule="auto"/>
+            </w:pPr>
+            <w:r>
+              <w:rPr>
+                <w:rFonts w:ascii="JetBrains Mono" w:hAnsi="JetBrains Mono" w:eastAsia="JetBrains Mono" w:cs="JetBrains Mono"/>
+                <w:color w:val="17261F"/>
+                <w:sz w:val="16"/>
+                <w:szCs w:val="16"/>
+              </w:rPr>
+              <w:t xml:space="preserve">    notify["notify:* · 1 hora&lt;br/&gt;alertas sin repetir"]</w:t>
+            </w:r>
+          </w:p>
+          <w:p>
+            <w:pPr>
+              <w:spacing w:before="0" w:after="0" w:line="252" w:lineRule="auto"/>
+            </w:pPr>
+            <w:r>
+              <w:rPr>
+                <w:rFonts w:ascii="JetBrains Mono" w:hAnsi="JetBrains Mono" w:eastAsia="JetBrains Mono" w:cs="JetBrains Mono"/>
+                <w:color w:val="17261F"/>
+                <w:sz w:val="16"/>
+                <w:szCs w:val="16"/>
+              </w:rPr>
+              <w:t xml:space="preserve">    profiles["ai:crop-profiles · 1 hora&lt;br/&gt;ai:learning-status · 1 minuto"]</w:t>
+            </w:r>
+          </w:p>
+          <w:p>
+            <w:pPr>
+              <w:spacing w:before="0" w:after="0" w:line="252" w:lineRule="auto"/>
+            </w:pPr>
+            <w:r>
+              <w:rPr>
+                <w:rFonts w:ascii="JetBrains Mono" w:hAnsi="JetBrains Mono" w:eastAsia="JetBrains Mono" w:cs="JetBrains Mono"/>
+                <w:color w:val="17261F"/>
+                <w:sz w:val="16"/>
+                <w:szCs w:val="16"/>
+              </w:rPr>
+              <w:t xml:space="preserve">    link["channel-link:telegram:código · 10 min&lt;br/&gt;se borra al usarse (GETDEL)"]</w:t>
+            </w:r>
+          </w:p>
+          <w:p>
+            <w:pPr>
+              <w:spacing w:before="0" w:after="0" w:line="252" w:lineRule="auto"/>
+            </w:pPr>
+            <w:r>
+              <w:rPr>
+                <w:rFonts w:ascii="JetBrains Mono" w:hAnsi="JetBrains Mono" w:eastAsia="JetBrains Mono" w:cs="JetBrains Mono"/>
+                <w:color w:val="17261F"/>
+                <w:sz w:val="16"/>
+                <w:szCs w:val="16"/>
+              </w:rPr>
+              <w:t xml:space="preserve">    share["crop-share:telegram:código · 10 min&lt;br/&gt;compartir un cultivo con otro chat"]</w:t>
+            </w:r>
+          </w:p>
+          <w:p>
+            <w:pPr>
+              <w:spacing w:before="0" w:after="0" w:line="252" w:lineRule="auto"/>
+            </w:pPr>
+            <w:r>
+              <w:rPr>
+                <w:rFonts w:ascii="JetBrains Mono" w:hAnsi="JetBrains Mono" w:eastAsia="JetBrains Mono" w:cs="JetBrains Mono"/>
+                <w:color w:val="17261F"/>
+                <w:sz w:val="16"/>
+                <w:szCs w:val="16"/>
+              </w:rPr>
+              <w:t xml:space="preserve">    weather["weather:lat:lon · 10 min&lt;br/&gt;clima del lugar · 2 min si falló"]</w:t>
+            </w:r>
+          </w:p>
+          <w:p>
+            <w:pPr>
+              <w:spacing w:before="0" w:after="0" w:line="252" w:lineRule="auto"/>
+            </w:pPr>
+            <w:r>
+              <w:rPr>
+                <w:rFonts w:ascii="JetBrains Mono" w:hAnsi="JetBrains Mono" w:eastAsia="JetBrains Mono" w:cs="JetBrains Mono"/>
+                <w:color w:val="17261F"/>
+                <w:sz w:val="16"/>
+                <w:szCs w:val="16"/>
+              </w:rPr>
+              <w:t xml:space="preserve">  end</w:t>
+            </w:r>
+          </w:p>
+          <w:p>
+            <w:pPr>
+              <w:spacing w:before="0" w:after="0" w:line="252" w:lineRule="auto"/>
+            </w:pPr>
+            <w:r>
+              <w:rPr>
+                <w:rFonts w:ascii="JetBrains Mono" w:hAnsi="JetBrains Mono" w:eastAsia="JetBrains Mono" w:cs="JetBrains Mono"/>
+                <w:color w:val="17261F"/>
+                <w:sz w:val="16"/>
+                <w:szCs w:val="16"/>
+              </w:rPr>
+              <w:t xml:space="preserve">  http["Filtro de peticiones"] --&gt; rate</w:t>
+            </w:r>
+          </w:p>
+          <w:p>
+            <w:pPr>
+              <w:spacing w:before="0" w:after="0" w:line="252" w:lineRule="auto"/>
+            </w:pPr>
+            <w:r>
+              <w:rPr>
+                <w:rFonts w:ascii="JetBrains Mono" w:hAnsi="JetBrains Mono" w:eastAsia="JetBrains Mono" w:cs="JetBrains Mono"/>
+                <w:color w:val="17261F"/>
+                <w:sz w:val="16"/>
+                <w:szCs w:val="16"/>
+              </w:rPr>
+              <w:t xml:space="preserve">  mqtt["Telemetría MQTT"] --&gt; reading</w:t>
+            </w:r>
+          </w:p>
+          <w:p>
+            <w:pPr>
+              <w:spacing w:before="0" w:after="0" w:line="252" w:lineRule="auto"/>
+            </w:pPr>
+            <w:r>
+              <w:rPr>
+                <w:rFonts w:ascii="JetBrains Mono" w:hAnsi="JetBrains Mono" w:eastAsia="JetBrains Mono" w:cs="JetBrains Mono"/>
+                <w:color w:val="17261F"/>
+                <w:sz w:val="16"/>
+                <w:szCs w:val="16"/>
+              </w:rPr>
+              <w:t xml:space="preserve">  mqtt --&gt; aieval --&gt; agent</w:t>
+            </w:r>
+          </w:p>
+          <w:p>
+            <w:pPr>
+              <w:spacing w:before="0" w:after="0" w:line="252" w:lineRule="auto"/>
+            </w:pPr>
+            <w:r>
+              <w:rPr>
+                <w:rFonts w:ascii="JetBrains Mono" w:hAnsi="JetBrains Mono" w:eastAsia="JetBrains Mono" w:cs="JetBrains Mono"/>
+                <w:color w:val="17261F"/>
+                <w:sz w:val="16"/>
+                <w:szCs w:val="16"/>
+              </w:rPr>
+              <w:t xml:space="preserve">  alerts["Notificaciones"] --&gt; notify</w:t>
+            </w:r>
+          </w:p>
+          <w:p>
+            <w:pPr>
+              <w:spacing w:before="0" w:after="0" w:line="252" w:lineRule="auto"/>
+            </w:pPr>
+            <w:r>
+              <w:rPr>
+                <w:rFonts w:ascii="JetBrains Mono" w:hAnsi="JetBrains Mono" w:eastAsia="JetBrains Mono" w:cs="JetBrains Mono"/>
+                <w:color w:val="17261F"/>
+                <w:sz w:val="16"/>
+                <w:szCs w:val="16"/>
+              </w:rPr>
+              <w:t xml:space="preserve">  ai["Cliente de la IA"] --&gt; profiles</w:t>
+            </w:r>
+          </w:p>
+          <w:p>
+            <w:pPr>
+              <w:spacing w:before="0" w:after="0" w:line="252" w:lineRule="auto"/>
+            </w:pPr>
+            <w:r>
+              <w:rPr>
+                <w:rFonts w:ascii="JetBrains Mono" w:hAnsi="JetBrains Mono" w:eastAsia="JetBrains Mono" w:cs="JetBrains Mono"/>
+                <w:color w:val="17261F"/>
+                <w:sz w:val="16"/>
+                <w:szCs w:val="16"/>
+              </w:rPr>
+              <w:t xml:space="preserve">  tg["Vincular Telegram"] --&gt; link</w:t>
+            </w:r>
+          </w:p>
+          <w:p>
+            <w:pPr>
+              <w:spacing w:before="0" w:after="0" w:line="252" w:lineRule="auto"/>
+            </w:pPr>
+            <w:r>
+              <w:rPr>
+                <w:rFonts w:ascii="JetBrains Mono" w:hAnsi="JetBrains Mono" w:eastAsia="JetBrains Mono" w:cs="JetBrains Mono"/>
+                <w:color w:val="17261F"/>
+                <w:sz w:val="16"/>
+                <w:szCs w:val="16"/>
+              </w:rPr>
+              <w:t xml:space="preserve">  tg --&gt; share</w:t>
+            </w:r>
+          </w:p>
+          <w:p>
+            <w:pPr>
+              <w:spacing w:before="0" w:after="0" w:line="252" w:lineRule="auto"/>
+            </w:pPr>
+            <w:r>
+              <w:rPr>
+                <w:rFonts w:ascii="JetBrains Mono" w:hAnsi="JetBrains Mono" w:eastAsia="JetBrains Mono" w:cs="JetBrains Mono"/>
+                <w:color w:val="17261F"/>
+                <w:sz w:val="16"/>
+                <w:szCs w:val="16"/>
+              </w:rPr>
+              <w:t xml:space="preserve">  crops["Lugar del cultivo"] --&gt; weather</w:t>
+            </w:r>
+          </w:p>
+          <w:p>
+            <w:pPr>
+              <w:spacing w:before="0" w:after="0" w:line="252" w:lineRule="auto"/>
+            </w:pPr>
+            <w:r>
+              <w:rPr>
+                <w:rFonts w:ascii="JetBrains Mono" w:hAnsi="JetBrains Mono" w:eastAsia="JetBrains Mono" w:cs="JetBrains Mono"/>
+                <w:color w:val="17261F"/>
+                <w:sz w:val="16"/>
+                <w:szCs w:val="16"/>
+              </w:rPr>
+              <w:t xml:space="preserve">  classDef leaf fill:#DDF5EA,stroke:#067A52,color:#17261F</w:t>
+            </w:r>
+          </w:p>
+          <w:p>
+            <w:pPr>
+              <w:spacing w:before="0" w:after="0" w:line="252" w:lineRule="auto"/>
+            </w:pPr>
+            <w:r>
+              <w:rPr>
+                <w:rFonts w:ascii="JetBrains Mono" w:hAnsi="JetBrains Mono" w:eastAsia="JetBrains Mono" w:cs="JetBrains Mono"/>
+                <w:color w:val="17261F"/>
+                <w:sz w:val="16"/>
+                <w:szCs w:val="16"/>
+              </w:rPr>
+              <w:t xml:space="preserve">  classDef water fill:#E3F2FB,stroke:#1F6FA0,color:#17261F</w:t>
+            </w:r>
+          </w:p>
+          <w:p>
+            <w:pPr>
+              <w:spacing w:before="0" w:after="0" w:line="252" w:lineRule="auto"/>
+            </w:pPr>
+            <w:r>
+              <w:rPr>
+                <w:rFonts w:ascii="JetBrains Mono" w:hAnsi="JetBrains Mono" w:eastAsia="JetBrains Mono" w:cs="JetBrains Mono"/>
+                <w:color w:val="17261F"/>
+                <w:sz w:val="16"/>
+                <w:szCs w:val="16"/>
+              </w:rPr>
+              <w:t xml:space="preserve">  classDef sun fill:#FDF4DD,stroke:#C98D12,color:#17261F</w:t>
+            </w:r>
+          </w:p>
+          <w:p>
+            <w:pPr>
+              <w:spacing w:before="0" w:after="0" w:line="252" w:lineRule="auto"/>
+            </w:pPr>
+            <w:r>
+              <w:rPr>
+                <w:rFonts w:ascii="JetBrains Mono" w:hAnsi="JetBrains Mono" w:eastAsia="JetBrains Mono" w:cs="JetBrains Mono"/>
+                <w:color w:val="17261F"/>
+                <w:sz w:val="16"/>
+                <w:szCs w:val="16"/>
+              </w:rPr>
+              <w:t xml:space="preserve">  classDef clay fill:#FBE9E1,stroke:#B85A38,color:#17261F</w:t>
+            </w:r>
+          </w:p>
+          <w:p>
+            <w:pPr>
+              <w:spacing w:before="0" w:after="0" w:line="252" w:lineRule="auto"/>
+            </w:pPr>
+            <w:r>
+              <w:rPr>
+                <w:rFonts w:ascii="JetBrains Mono" w:hAnsi="JetBrains Mono" w:eastAsia="JetBrains Mono" w:cs="JetBrains Mono"/>
+                <w:color w:val="17261F"/>
+                <w:sz w:val="16"/>
+                <w:szCs w:val="16"/>
+              </w:rPr>
+              <w:t xml:space="preserve">  classDef core fill:#067A52,stroke:#0B3D2B,color:#FFFFFF</w:t>
+            </w:r>
+          </w:p>
+          <w:p>
+            <w:pPr>
+              <w:spacing w:before="0" w:after="0" w:line="252" w:lineRule="auto"/>
+            </w:pPr>
+            <w:r>
+              <w:rPr>
+                <w:rFonts w:ascii="JetBrains Mono" w:hAnsi="JetBrains Mono" w:eastAsia="JetBrains Mono" w:cs="JetBrains Mono"/>
+                <w:color w:val="17261F"/>
+                <w:sz w:val="16"/>
+                <w:szCs w:val="16"/>
+              </w:rPr>
+              <w:t xml:space="preserve">  classDef deep fill:#0B3D2B,stroke:#06281C,color:#FFFFFF</w:t>
+            </w:r>
+          </w:p>
+          <w:p>
+            <w:pPr>
+              <w:spacing w:before="0" w:after="0" w:line="252" w:lineRule="auto"/>
+            </w:pPr>
+            <w:r>
+              <w:rPr>
+                <w:rFonts w:ascii="JetBrains Mono" w:hAnsi="JetBrains Mono" w:eastAsia="JetBrains Mono" w:cs="JetBrains Mono"/>
+                <w:color w:val="17261F"/>
+                <w:sz w:val="16"/>
+                <w:szCs w:val="16"/>
+              </w:rPr>
+              <w:t xml:space="preserve">  classDef muted fill:#F2F7F4,stroke:#5B6B63,color:#17261F</w:t>
+            </w:r>
+          </w:p>
+          <w:p>
+            <w:pPr>
+              <w:spacing w:before="0" w:after="0" w:line="252" w:lineRule="auto"/>
+            </w:pPr>
+            <w:r>
+              <w:rPr>
+                <w:rFonts w:ascii="JetBrains Mono" w:hAnsi="JetBrains Mono" w:eastAsia="JetBrains Mono" w:cs="JetBrains Mono"/>
+                <w:color w:val="17261F"/>
+                <w:sz w:val="16"/>
+                <w:szCs w:val="16"/>
+              </w:rPr>
+              <w:t xml:space="preserve">  class rate,reading,aieval,agent,notify,profiles,link,share,weather leaf</w:t>
+            </w:r>
+          </w:p>
+          <w:p>
+            <w:pPr>
+              <w:spacing w:before="0" w:after="0" w:line="252" w:lineRule="auto"/>
+            </w:pPr>
+            <w:r>
+              <w:rPr>
+                <w:rFonts w:ascii="JetBrains Mono" w:hAnsi="JetBrains Mono" w:eastAsia="JetBrains Mono" w:cs="JetBrains Mono"/>
+                <w:color w:val="17261F"/>
+                <w:sz w:val="16"/>
+                <w:szCs w:val="16"/>
+              </w:rPr>
+              <w:t xml:space="preserve">  class http,mqtt,alerts,ai,tg,crops water</w:t>
+            </w:r>
+          </w:p>
+        </w:tc>
+      </w:tr>
+    </w:tbl>
+    <w:p>
+      <w:pPr>
+        <w:spacing w:before="160" w:after="0" w:line="240" w:lineRule="auto"/>
+        <w:rPr>
+          <w:sz w:val="8"/>
+        </w:rPr>
+      </w:pPr>
     </w:p>
     <w:p>
       <w:pPr>
@@ -2551,7 +3577,7 @@
               <w:sz w:val="14"/>
               <w:szCs w:val="14"/>
             </w:rPr>
-            <w:t xml:space="preserve">SMARTPOT-CACHE · V1.0</w:t>
+            <w:t xml:space="preserve">SMARTPOT-CACHE · V1.1</w:t>
           </w:r>
         </w:p>
       </w:tc>

</xml_diff>